<commit_message>
added output for handson 2
</commit_message>
<xml_diff>
--- a/week5/Angular-HandsOn/Shubham/Documentation.docx
+++ b/week5/Angular-HandsOn/Shubham/Documentation.docx
@@ -1060,6 +1060,9 @@
           <w:ilvl w:val="0"/>
           <w:numId w:val="3"/>
         </w:numPr>
+        <w:pBdr>
+          <w:bottom w:val="single" w:sz="6" w:space="1" w:color="auto"/>
+        </w:pBdr>
         <w:rPr>
           <w:sz w:val="28"/>
           <w:szCs w:val="28"/>
@@ -1080,12 +1083,194 @@
           <w:szCs w:val="28"/>
         </w:rPr>
       </w:pPr>
+    </w:p>
+    <w:p>
+      <w:pPr>
+        <w:rPr>
+          <w:sz w:val="28"/>
+          <w:szCs w:val="28"/>
+        </w:rPr>
+      </w:pPr>
+    </w:p>
+    <w:p>
+      <w:pPr>
+        <w:rPr>
+          <w:sz w:val="28"/>
+          <w:szCs w:val="28"/>
+        </w:rPr>
+      </w:pPr>
+    </w:p>
+    <w:p>
+      <w:pPr>
+        <w:rPr>
+          <w:sz w:val="28"/>
+          <w:szCs w:val="28"/>
+        </w:rPr>
+      </w:pPr>
+    </w:p>
+    <w:p>
+      <w:pPr>
+        <w:rPr>
+          <w:sz w:val="28"/>
+          <w:szCs w:val="28"/>
+        </w:rPr>
+      </w:pPr>
+    </w:p>
+    <w:p>
+      <w:pPr>
+        <w:rPr>
+          <w:sz w:val="28"/>
+          <w:szCs w:val="28"/>
+        </w:rPr>
+      </w:pPr>
+    </w:p>
+    <w:p>
+      <w:pPr>
+        <w:rPr>
+          <w:b/>
+          <w:bCs/>
+          <w:sz w:val="32"/>
+          <w:szCs w:val="32"/>
+        </w:rPr>
+      </w:pPr>
       <w:r>
         <w:rPr>
-          <w:sz w:val="28"/>
-          <w:szCs w:val="28"/>
-        </w:rPr>
-        <w:t>---------------------------------------------------------------------------------------------------------</w:t>
+          <w:b/>
+          <w:bCs/>
+          <w:sz w:val="32"/>
+          <w:szCs w:val="32"/>
+        </w:rPr>
+        <w:lastRenderedPageBreak/>
+        <w:t>Hands On 1 Output</w:t>
+      </w:r>
+    </w:p>
+    <w:p>
+      <w:pPr>
+        <w:rPr>
+          <w:sz w:val="28"/>
+          <w:szCs w:val="28"/>
+        </w:rPr>
+      </w:pPr>
+      <w:r>
+        <w:rPr>
+          <w:sz w:val="28"/>
+          <w:szCs w:val="28"/>
+        </w:rPr>
+        <w:drawing>
+          <wp:inline distT="0" distB="0" distL="0" distR="0" wp14:anchorId="26B686D5" wp14:editId="3AD1832A">
+            <wp:extent cx="3193259" cy="4324350"/>
+            <wp:effectExtent l="0" t="0" r="7620" b="0"/>
+            <wp:docPr id="1576665085" name="Picture 1"/>
+            <wp:cNvGraphicFramePr>
+              <a:graphicFrameLocks xmlns:a="http://schemas.openxmlformats.org/drawingml/2006/main" noChangeAspect="1"/>
+            </wp:cNvGraphicFramePr>
+            <a:graphic xmlns:a="http://schemas.openxmlformats.org/drawingml/2006/main">
+              <a:graphicData uri="http://schemas.openxmlformats.org/drawingml/2006/picture">
+                <pic:pic xmlns:pic="http://schemas.openxmlformats.org/drawingml/2006/picture">
+                  <pic:nvPicPr>
+                    <pic:cNvPr id="1576665085" name=""/>
+                    <pic:cNvPicPr/>
+                  </pic:nvPicPr>
+                  <pic:blipFill>
+                    <a:blip r:embed="rId5"/>
+                    <a:stretch>
+                      <a:fillRect/>
+                    </a:stretch>
+                  </pic:blipFill>
+                  <pic:spPr>
+                    <a:xfrm>
+                      <a:off x="0" y="0"/>
+                      <a:ext cx="3198763" cy="4331803"/>
+                    </a:xfrm>
+                    <a:prstGeom prst="rect">
+                      <a:avLst/>
+                    </a:prstGeom>
+                  </pic:spPr>
+                </pic:pic>
+              </a:graphicData>
+            </a:graphic>
+          </wp:inline>
+        </w:drawing>
+      </w:r>
+    </w:p>
+    <w:p>
+      <w:pPr>
+        <w:rPr>
+          <w:b/>
+          <w:bCs/>
+          <w:sz w:val="32"/>
+          <w:szCs w:val="32"/>
+        </w:rPr>
+      </w:pPr>
+      <w:r>
+        <w:rPr>
+          <w:b/>
+          <w:bCs/>
+          <w:sz w:val="32"/>
+          <w:szCs w:val="32"/>
+        </w:rPr>
+        <w:t>Hands On 2 Output</w:t>
+      </w:r>
+    </w:p>
+    <w:p>
+      <w:pPr>
+        <w:rPr>
+          <w:sz w:val="28"/>
+          <w:szCs w:val="28"/>
+        </w:rPr>
+      </w:pPr>
+      <w:r>
+        <w:rPr>
+          <w:noProof/>
+        </w:rPr>
+        <w:drawing>
+          <wp:inline distT="0" distB="0" distL="0" distR="0" wp14:anchorId="366D24A7" wp14:editId="1415A846">
+            <wp:extent cx="5731510" cy="3568700"/>
+            <wp:effectExtent l="0" t="0" r="2540" b="0"/>
+            <wp:docPr id="494877965" name="Picture 1"/>
+            <wp:cNvGraphicFramePr>
+              <a:graphicFrameLocks xmlns:a="http://schemas.openxmlformats.org/drawingml/2006/main" noChangeAspect="1"/>
+            </wp:cNvGraphicFramePr>
+            <a:graphic xmlns:a="http://schemas.openxmlformats.org/drawingml/2006/main">
+              <a:graphicData uri="http://schemas.openxmlformats.org/drawingml/2006/picture">
+                <pic:pic xmlns:pic="http://schemas.openxmlformats.org/drawingml/2006/picture">
+                  <pic:nvPicPr>
+                    <pic:cNvPr id="0" name="Picture 1"/>
+                    <pic:cNvPicPr>
+                      <a:picLocks noChangeAspect="1" noChangeArrowheads="1"/>
+                    </pic:cNvPicPr>
+                  </pic:nvPicPr>
+                  <pic:blipFill>
+                    <a:blip r:embed="rId6">
+                      <a:extLst>
+                        <a:ext uri="{28A0092B-C50C-407E-A947-70E740481C1C}">
+                          <a14:useLocalDpi xmlns:a14="http://schemas.microsoft.com/office/drawing/2010/main" val="0"/>
+                        </a:ext>
+                      </a:extLst>
+                    </a:blip>
+                    <a:srcRect/>
+                    <a:stretch>
+                      <a:fillRect/>
+                    </a:stretch>
+                  </pic:blipFill>
+                  <pic:spPr bwMode="auto">
+                    <a:xfrm>
+                      <a:off x="0" y="0"/>
+                      <a:ext cx="5731510" cy="3568700"/>
+                    </a:xfrm>
+                    <a:prstGeom prst="rect">
+                      <a:avLst/>
+                    </a:prstGeom>
+                    <a:noFill/>
+                    <a:ln>
+                      <a:noFill/>
+                    </a:ln>
+                  </pic:spPr>
+                </pic:pic>
+              </a:graphicData>
+            </a:graphic>
+          </wp:inline>
+        </w:drawing>
       </w:r>
     </w:p>
     <w:sectPr>
@@ -2162,6 +2347,7 @@
   <w:style w:type="character" w:default="1" w:styleId="DefaultParagraphFont">
     <w:name w:val="Default Paragraph Font"/>
     <w:uiPriority w:val="1"/>
+    <w:semiHidden/>
     <w:unhideWhenUsed/>
   </w:style>
   <w:style w:type="table" w:default="1" w:styleId="TableNormal">

</xml_diff>

<commit_message>
feat: complete Hands-On 3 - directives and pipes
</commit_message>
<xml_diff>
--- a/week5/Angular-HandsOn/Shubham/Documentation.docx
+++ b/week5/Angular-HandsOn/Shubham/Documentation.docx
@@ -1060,6 +1060,9 @@
           <w:ilvl w:val="0"/>
           <w:numId w:val="3"/>
         </w:numPr>
+        <w:pBdr>
+          <w:bottom w:val="single" w:sz="6" w:space="1" w:color="auto"/>
+        </w:pBdr>
         <w:rPr>
           <w:sz w:val="28"/>
           <w:szCs w:val="28"/>
@@ -1080,12 +1083,321 @@
           <w:szCs w:val="28"/>
         </w:rPr>
       </w:pPr>
-      <w:r>
-        <w:rPr>
-          <w:sz w:val="28"/>
-          <w:szCs w:val="28"/>
-        </w:rPr>
-        <w:t>---------------------------------------------------------------------------------------------------------</w:t>
+    </w:p>
+    <w:p>
+      <w:pPr>
+        <w:rPr>
+          <w:sz w:val="28"/>
+          <w:szCs w:val="28"/>
+        </w:rPr>
+      </w:pPr>
+    </w:p>
+    <w:p>
+      <w:pPr>
+        <w:rPr>
+          <w:sz w:val="28"/>
+          <w:szCs w:val="28"/>
+        </w:rPr>
+      </w:pPr>
+    </w:p>
+    <w:p>
+      <w:pPr>
+        <w:rPr>
+          <w:sz w:val="28"/>
+          <w:szCs w:val="28"/>
+        </w:rPr>
+      </w:pPr>
+    </w:p>
+    <w:p>
+      <w:pPr>
+        <w:rPr>
+          <w:sz w:val="28"/>
+          <w:szCs w:val="28"/>
+        </w:rPr>
+      </w:pPr>
+    </w:p>
+    <w:p>
+      <w:pPr>
+        <w:rPr>
+          <w:sz w:val="28"/>
+          <w:szCs w:val="28"/>
+        </w:rPr>
+      </w:pPr>
+    </w:p>
+    <w:p>
+      <w:pPr>
+        <w:rPr>
+          <w:b/>
+          <w:bCs/>
+          <w:sz w:val="28"/>
+          <w:szCs w:val="28"/>
+        </w:rPr>
+      </w:pPr>
+      <w:r>
+        <w:rPr>
+          <w:b/>
+          <w:bCs/>
+          <w:sz w:val="28"/>
+          <w:szCs w:val="28"/>
+        </w:rPr>
+        <w:lastRenderedPageBreak/>
+        <w:t xml:space="preserve">Hand On </w:t>
+      </w:r>
+      <w:r>
+        <w:rPr>
+          <w:b/>
+          <w:bCs/>
+          <w:sz w:val="28"/>
+          <w:szCs w:val="28"/>
+        </w:rPr>
+        <w:t xml:space="preserve">1 </w:t>
+      </w:r>
+      <w:r>
+        <w:rPr>
+          <w:b/>
+          <w:bCs/>
+          <w:sz w:val="28"/>
+          <w:szCs w:val="28"/>
+        </w:rPr>
+        <w:t>output</w:t>
+      </w:r>
+    </w:p>
+    <w:p>
+      <w:pPr>
+        <w:rPr>
+          <w:b/>
+          <w:bCs/>
+          <w:sz w:val="28"/>
+          <w:szCs w:val="28"/>
+        </w:rPr>
+      </w:pPr>
+      <w:r>
+        <w:rPr>
+          <w:b/>
+          <w:bCs/>
+          <w:sz w:val="28"/>
+          <w:szCs w:val="28"/>
+        </w:rPr>
+        <w:drawing>
+          <wp:inline distT="0" distB="0" distL="0" distR="0" wp14:anchorId="404FFE66" wp14:editId="65AFD95D">
+            <wp:extent cx="3898900" cy="5137960"/>
+            <wp:effectExtent l="0" t="0" r="6350" b="5715"/>
+            <wp:docPr id="1009957239" name="Picture 1"/>
+            <wp:cNvGraphicFramePr>
+              <a:graphicFrameLocks xmlns:a="http://schemas.openxmlformats.org/drawingml/2006/main" noChangeAspect="1"/>
+            </wp:cNvGraphicFramePr>
+            <a:graphic xmlns:a="http://schemas.openxmlformats.org/drawingml/2006/main">
+              <a:graphicData uri="http://schemas.openxmlformats.org/drawingml/2006/picture">
+                <pic:pic xmlns:pic="http://schemas.openxmlformats.org/drawingml/2006/picture">
+                  <pic:nvPicPr>
+                    <pic:cNvPr id="1009957239" name=""/>
+                    <pic:cNvPicPr/>
+                  </pic:nvPicPr>
+                  <pic:blipFill>
+                    <a:blip r:embed="rId5"/>
+                    <a:stretch>
+                      <a:fillRect/>
+                    </a:stretch>
+                  </pic:blipFill>
+                  <pic:spPr>
+                    <a:xfrm>
+                      <a:off x="0" y="0"/>
+                      <a:ext cx="3907672" cy="5149519"/>
+                    </a:xfrm>
+                    <a:prstGeom prst="rect">
+                      <a:avLst/>
+                    </a:prstGeom>
+                  </pic:spPr>
+                </pic:pic>
+              </a:graphicData>
+            </a:graphic>
+          </wp:inline>
+        </w:drawing>
+      </w:r>
+    </w:p>
+    <w:p>
+      <w:pPr>
+        <w:rPr>
+          <w:b/>
+          <w:bCs/>
+          <w:sz w:val="28"/>
+          <w:szCs w:val="28"/>
+        </w:rPr>
+      </w:pPr>
+      <w:r>
+        <w:rPr>
+          <w:b/>
+          <w:bCs/>
+          <w:sz w:val="28"/>
+          <w:szCs w:val="28"/>
+        </w:rPr>
+        <w:t xml:space="preserve">Hand On </w:t>
+      </w:r>
+      <w:r>
+        <w:rPr>
+          <w:b/>
+          <w:bCs/>
+          <w:sz w:val="28"/>
+          <w:szCs w:val="28"/>
+        </w:rPr>
+        <w:t>2</w:t>
+      </w:r>
+      <w:r>
+        <w:rPr>
+          <w:b/>
+          <w:bCs/>
+          <w:sz w:val="28"/>
+          <w:szCs w:val="28"/>
+        </w:rPr>
+        <w:t xml:space="preserve"> </w:t>
+      </w:r>
+      <w:proofErr w:type="gramStart"/>
+      <w:r>
+        <w:rPr>
+          <w:b/>
+          <w:bCs/>
+          <w:sz w:val="28"/>
+          <w:szCs w:val="28"/>
+        </w:rPr>
+        <w:t>output</w:t>
+      </w:r>
+      <w:proofErr w:type="gramEnd"/>
+    </w:p>
+    <w:p>
+      <w:pPr>
+        <w:rPr>
+          <w:b/>
+          <w:bCs/>
+          <w:sz w:val="28"/>
+          <w:szCs w:val="28"/>
+        </w:rPr>
+      </w:pPr>
+      <w:r>
+        <w:rPr>
+          <w:b/>
+          <w:bCs/>
+          <w:sz w:val="28"/>
+          <w:szCs w:val="28"/>
+        </w:rPr>
+        <w:drawing>
+          <wp:inline distT="0" distB="0" distL="0" distR="0" wp14:anchorId="4394DC73" wp14:editId="1FD63AAC">
+            <wp:extent cx="5731510" cy="2562225"/>
+            <wp:effectExtent l="0" t="0" r="2540" b="9525"/>
+            <wp:docPr id="1985896851" name="Picture 1"/>
+            <wp:cNvGraphicFramePr>
+              <a:graphicFrameLocks xmlns:a="http://schemas.openxmlformats.org/drawingml/2006/main" noChangeAspect="1"/>
+            </wp:cNvGraphicFramePr>
+            <a:graphic xmlns:a="http://schemas.openxmlformats.org/drawingml/2006/main">
+              <a:graphicData uri="http://schemas.openxmlformats.org/drawingml/2006/picture">
+                <pic:pic xmlns:pic="http://schemas.openxmlformats.org/drawingml/2006/picture">
+                  <pic:nvPicPr>
+                    <pic:cNvPr id="1985896851" name=""/>
+                    <pic:cNvPicPr/>
+                  </pic:nvPicPr>
+                  <pic:blipFill>
+                    <a:blip r:embed="rId6"/>
+                    <a:stretch>
+                      <a:fillRect/>
+                    </a:stretch>
+                  </pic:blipFill>
+                  <pic:spPr>
+                    <a:xfrm>
+                      <a:off x="0" y="0"/>
+                      <a:ext cx="5731510" cy="2562225"/>
+                    </a:xfrm>
+                    <a:prstGeom prst="rect">
+                      <a:avLst/>
+                    </a:prstGeom>
+                  </pic:spPr>
+                </pic:pic>
+              </a:graphicData>
+            </a:graphic>
+          </wp:inline>
+        </w:drawing>
+      </w:r>
+    </w:p>
+    <w:p>
+      <w:pPr>
+        <w:rPr>
+          <w:b/>
+          <w:bCs/>
+          <w:sz w:val="28"/>
+          <w:szCs w:val="28"/>
+        </w:rPr>
+      </w:pPr>
+      <w:r>
+        <w:rPr>
+          <w:b/>
+          <w:bCs/>
+          <w:sz w:val="28"/>
+          <w:szCs w:val="28"/>
+        </w:rPr>
+        <w:lastRenderedPageBreak/>
+        <w:t xml:space="preserve">Hand On 3 </w:t>
+      </w:r>
+      <w:proofErr w:type="gramStart"/>
+      <w:r>
+        <w:rPr>
+          <w:b/>
+          <w:bCs/>
+          <w:sz w:val="28"/>
+          <w:szCs w:val="28"/>
+        </w:rPr>
+        <w:t>output</w:t>
+      </w:r>
+      <w:proofErr w:type="gramEnd"/>
+    </w:p>
+    <w:p>
+      <w:pPr>
+        <w:rPr>
+          <w:b/>
+          <w:bCs/>
+          <w:sz w:val="28"/>
+          <w:szCs w:val="28"/>
+        </w:rPr>
+      </w:pPr>
+      <w:r>
+        <w:rPr>
+          <w:b/>
+          <w:bCs/>
+          <w:sz w:val="28"/>
+          <w:szCs w:val="28"/>
+        </w:rPr>
+        <w:drawing>
+          <wp:inline distT="0" distB="0" distL="0" distR="0" wp14:anchorId="4B0E1B4E" wp14:editId="269BEB5A">
+            <wp:extent cx="5731510" cy="2499995"/>
+            <wp:effectExtent l="0" t="0" r="2540" b="0"/>
+            <wp:docPr id="46865388" name="Picture 1"/>
+            <wp:cNvGraphicFramePr>
+              <a:graphicFrameLocks xmlns:a="http://schemas.openxmlformats.org/drawingml/2006/main" noChangeAspect="1"/>
+            </wp:cNvGraphicFramePr>
+            <a:graphic xmlns:a="http://schemas.openxmlformats.org/drawingml/2006/main">
+              <a:graphicData uri="http://schemas.openxmlformats.org/drawingml/2006/picture">
+                <pic:pic xmlns:pic="http://schemas.openxmlformats.org/drawingml/2006/picture">
+                  <pic:nvPicPr>
+                    <pic:cNvPr id="46865388" name=""/>
+                    <pic:cNvPicPr/>
+                  </pic:nvPicPr>
+                  <pic:blipFill>
+                    <a:blip r:embed="rId7"/>
+                    <a:stretch>
+                      <a:fillRect/>
+                    </a:stretch>
+                  </pic:blipFill>
+                  <pic:spPr>
+                    <a:xfrm>
+                      <a:off x="0" y="0"/>
+                      <a:ext cx="5731510" cy="2499995"/>
+                    </a:xfrm>
+                    <a:prstGeom prst="rect">
+                      <a:avLst/>
+                    </a:prstGeom>
+                  </pic:spPr>
+                </pic:pic>
+              </a:graphicData>
+            </a:graphic>
+          </wp:inline>
+        </w:drawing>
       </w:r>
     </w:p>
     <w:sectPr>
@@ -2162,6 +2474,7 @@
   <w:style w:type="character" w:default="1" w:styleId="DefaultParagraphFont">
     <w:name w:val="Default Paragraph Font"/>
     <w:uiPriority w:val="1"/>
+    <w:semiHidden/>
     <w:unhideWhenUsed/>
   </w:style>
   <w:style w:type="table" w:default="1" w:styleId="TableNormal">

</xml_diff>

<commit_message>
feat: complete Hands-On 7 - routing, guards, and lazy loading
</commit_message>
<xml_diff>
--- a/week5/Angular-HandsOn/Shubham/Documentation.docx
+++ b/week5/Angular-HandsOn/Shubham/Documentation.docx
@@ -1153,6 +1153,7 @@
       </w:pPr>
       <w:r>
         <w:rPr>
+          <w:noProof/>
           <w:sz w:val="28"/>
           <w:szCs w:val="28"/>
         </w:rPr>
@@ -1265,6 +1266,75 @@
                     <a:ln>
                       <a:noFill/>
                     </a:ln>
+                  </pic:spPr>
+                </pic:pic>
+              </a:graphicData>
+            </a:graphic>
+          </wp:inline>
+        </w:drawing>
+      </w:r>
+    </w:p>
+    <w:p>
+      <w:pPr>
+        <w:rPr>
+          <w:b/>
+          <w:bCs/>
+          <w:sz w:val="28"/>
+          <w:szCs w:val="28"/>
+        </w:rPr>
+      </w:pPr>
+      <w:r>
+        <w:rPr>
+          <w:b/>
+          <w:bCs/>
+          <w:sz w:val="28"/>
+          <w:szCs w:val="28"/>
+        </w:rPr>
+        <w:lastRenderedPageBreak/>
+        <w:t>Hands On 7 Output</w:t>
+      </w:r>
+    </w:p>
+    <w:p>
+      <w:pPr>
+        <w:rPr>
+          <w:sz w:val="28"/>
+          <w:szCs w:val="28"/>
+        </w:rPr>
+      </w:pPr>
+      <w:r>
+        <w:rPr>
+          <w:sz w:val="28"/>
+          <w:szCs w:val="28"/>
+        </w:rPr>
+        <w:drawing>
+          <wp:inline distT="0" distB="0" distL="0" distR="0" wp14:anchorId="54AD58BD" wp14:editId="1341D08A">
+            <wp:extent cx="5731510" cy="5410200"/>
+            <wp:effectExtent l="0" t="0" r="2540" b="0"/>
+            <wp:docPr id="200534589" name="Picture 1"/>
+            <wp:cNvGraphicFramePr>
+              <a:graphicFrameLocks xmlns:a="http://schemas.openxmlformats.org/drawingml/2006/main" noChangeAspect="1"/>
+            </wp:cNvGraphicFramePr>
+            <a:graphic xmlns:a="http://schemas.openxmlformats.org/drawingml/2006/main">
+              <a:graphicData uri="http://schemas.openxmlformats.org/drawingml/2006/picture">
+                <pic:pic xmlns:pic="http://schemas.openxmlformats.org/drawingml/2006/picture">
+                  <pic:nvPicPr>
+                    <pic:cNvPr id="200534589" name=""/>
+                    <pic:cNvPicPr/>
+                  </pic:nvPicPr>
+                  <pic:blipFill>
+                    <a:blip r:embed="rId7"/>
+                    <a:stretch>
+                      <a:fillRect/>
+                    </a:stretch>
+                  </pic:blipFill>
+                  <pic:spPr>
+                    <a:xfrm>
+                      <a:off x="0" y="0"/>
+                      <a:ext cx="5731510" cy="5410200"/>
+                    </a:xfrm>
+                    <a:prstGeom prst="rect">
+                      <a:avLst/>
+                    </a:prstGeom>
                   </pic:spPr>
                 </pic:pic>
               </a:graphicData>

</xml_diff>